<commit_message>
fix(打包): viz_symbols 延迟导入 plotly；把 python-docx 收回包里
打包体启动炸在 `No module named 'plotly'`，栈顶指向 viz_symbols 第 20 行。

这次不是排除清单的错，是 **viz_symbols 本身的依赖画错了**：
桌面端 desktop/scene.py 只从它拿 model_size 和 classify_support，
两个都只用 numpy；plotly 只有网页端那三个 *_traces 函数要。
可那行 import 写在顶层，于是**桌面端被迫依赖一个它一行都不用的绘图后端**。
平时看不出来，一排掉 plotly（它还会拖进 pyarrow、tornado 一大串）就暴露。

改成延迟导入 `_go()`，两端各取所需，网页端行为不变。
tests/test_viz_symbols_lazy.py 把 plotly 彻底挡掉再 import 一次，
另加一条 AST 断言钉住顶层不许再出现 plotly——有人"顺手整理 import"
挪回去时，报错要直指问题而不是绕一圈。

顺带把 python-docx 从排除清单拿回来，并在 hiddenimports 里点名：
report.to_docx 是延迟导入，静态分析看不见，不点名就收不进去。
表现是打包成功、点「报告」才说缺 python-docx——而拿到 exe 的人没有 pip，
这个提示对他毫无用处。代价是 lxml 十几兆，相对七百多兆可以忽略。

回归 1618 passed / 1 skipped。

Co-Authored-By: Claude Opus 5 <noreply@anthropic.com>
Claude-Session: https://claude.ai/code/session_01B7JxvW3bUvaF3dt2CpqHve
</commit_message>
<xml_diff>
--- a/docs/word/课程报告.docx
+++ b/docs/word/课程报告.docx
@@ -641,7 +641,7 @@
               <w:jc w:val="right"/>
             </w:pPr>
             <w:r>
-              <w:t xml:space="preserve">88</w:t>
+              <w:t xml:space="preserve">89</w:t>
             </w:r>
           </w:p>
         </w:tc>
@@ -653,19 +653,19 @@
               <w:jc w:val="right"/>
             </w:pPr>
             <w:r>
-              <w:t xml:space="preserve">20,876</w:t>
-            </w:r>
-          </w:p>
-        </w:tc>
-        <w:tc>
-          <w:tcPr/>
-          <w:p>
-            <w:pPr>
-              <w:pStyle w:val="Compact"/>
-              <w:jc w:val="left"/>
-            </w:pPr>
-            <w:r>
-              <w:t xml:space="preserve">自动回归 1,608 项</w:t>
+              <w:t xml:space="preserve">21,001</w:t>
+            </w:r>
+          </w:p>
+        </w:tc>
+        <w:tc>
+          <w:tcPr/>
+          <w:p>
+            <w:pPr>
+              <w:pStyle w:val="Compact"/>
+              <w:jc w:val="left"/>
+            </w:pPr>
+            <w:r>
+              <w:t xml:space="preserve">自动回归 1,619 项</w:t>
             </w:r>
           </w:p>
         </w:tc>
@@ -7866,7 +7866,7 @@
           <w:bCs/>
           <w:b/>
         </w:rPr>
-        <w:t xml:space="preserve">1,608 项</w:t>
+        <w:t xml:space="preserve">1,619 项</w:t>
       </w:r>
       <w:r>
         <w:t xml:space="preserve">。</w:t>
@@ -9206,7 +9206,7 @@
         <w:rPr>
           <w:rStyle w:val="NormalTok"/>
         </w:rPr>
-        <w:t xml:space="preserve">pytest                                        :: 全量回归 1608 项</w:t>
+        <w:t xml:space="preserve">pytest                                        :: 全量回归 1619 项</w:t>
       </w:r>
       <w:r>
         <w:br/>

</xml_diff>